<commit_message>
varios - claude audit
</commit_message>
<xml_diff>
--- a/docs/agent-rules.docx
+++ b/docs/agent-rules.docx
@@ -53,7 +53,7 @@
           <w:sz w:val="19"/>
           <w:szCs w:val="19"/>
         </w:rPr>
-        <w:t xml:space="preserve">Este documento é a fonte de verdade do modo agente: cada ficha corresponde a uma regra de detecção, a um valor do classificador LLM, a um botão na interface e a um bloco da suíte de teste. Documento e código mudam juntos — a tradução dele para código vive em src/lib/agent/.</w:t>
+        <w:t xml:space="preserve">Este documento é a fonte de verdade do modo agente: cada ficha corresponde a uma regra de detecção, a um valor do classificador LLM, a um botão na interface e a um bloco da suíte de teste. Documento e código mudam juntos — a tradução dele para código vive em src/agent/.</w:t>
       </w:r>
     </w:p>
     <w:p>
@@ -807,7 +807,7 @@
                 <w:sz w:val="19"/>
                 <w:szCs w:val="19"/>
               </w:rPr>
-              <w:t xml:space="preserve">O planejador roda ANTES da resposta e o resultado entra no systemPrompt daquela requisição, sob um cabeçalho que o marca como dado, não instrução. Custa de 1 a 3 segundos no início da resposta, e só nesse modo o agente toca o fluxo. O planejador decide em delivery se o dado é necessário (context), se basta oferecer o botão (card) ou se valem as duas coisas (both).</w:t>
+              <w:t xml:space="preserve">O planejador roda ANTES da resposta e o resultado entra no systemPrompt daquela requisição, sob um cabeçalho que o marca como dado, não instrução. Custa de 1 a 3 segundos no início da resposta, e só nesse modo o agente toca o fluxo. O planejador decide em delivery se o dado é necessário (context) ou se basta oferecer o botão (card). Havia um terceiro valor, both, retirado por não ter comportamento próprio: o botão do card aparece nos dois casos de qualquer forma, e a distinção só custava prompt.</w:t>
             </w:r>
           </w:p>
         </w:tc>
@@ -1210,6 +1210,708 @@
                 <w:szCs w:val="19"/>
               </w:rPr>
               <w:t xml:space="preserve">“Como citar o livro X” é um pedido só. Em contexto bibliográfico a busca literal se cala, em vez de exibir dois botões.</w:t>
+            </w:r>
+          </w:p>
+        </w:tc>
+      </w:tr>
+      <w:tr>
+        <w:tc>
+          <w:tcPr>
+            <w:tcW w:type="dxa" w:w="2400"/>
+            <w:tcBorders>
+              <w:top w:val="single" w:color="CBD8D2" w:sz="4"/>
+              <w:left w:val="single" w:color="CBD8D2" w:sz="4"/>
+              <w:bottom w:val="single" w:color="CBD8D2" w:sz="4"/>
+              <w:right w:val="single" w:color="CBD8D2" w:sz="4"/>
+            </w:tcBorders>
+            <w:tcMar>
+              <w:top w:type="dxa" w:w="90"/>
+              <w:left w:type="dxa" w:w="130"/>
+              <w:bottom w:type="dxa" w:w="90"/>
+              <w:right w:type="dxa" w:w="130"/>
+            </w:tcMar>
+            <w:vAlign w:val="center"/>
+          </w:tcPr>
+          <w:p>
+            <w:pPr>
+              <w:spacing w:after="80" w:before="0" w:line="264"/>
+            </w:pPr>
+            <w:r>
+              <w:rPr>
+                <w:b/>
+                <w:bCs/>
+                <w:color w:val="26332D"/>
+                <w:sz w:val="19"/>
+                <w:szCs w:val="19"/>
+              </w:rPr>
+              <w:t xml:space="preserve">Espera da triagem</w:t>
+            </w:r>
+          </w:p>
+        </w:tc>
+        <w:tc>
+          <w:tcPr>
+            <w:tcW w:type="dxa" w:w="2000"/>
+            <w:tcBorders>
+              <w:top w:val="single" w:color="CBD8D2" w:sz="4"/>
+              <w:left w:val="single" w:color="CBD8D2" w:sz="4"/>
+              <w:bottom w:val="single" w:color="CBD8D2" w:sz="4"/>
+              <w:right w:val="single" w:color="CBD8D2" w:sz="4"/>
+            </w:tcBorders>
+            <w:tcMar>
+              <w:top w:type="dxa" w:w="90"/>
+              <w:left w:type="dxa" w:w="130"/>
+              <w:bottom w:type="dxa" w:w="90"/>
+              <w:right w:type="dxa" w:w="130"/>
+            </w:tcMar>
+            <w:vAlign w:val="center"/>
+          </w:tcPr>
+          <w:p>
+            <w:pPr>
+              <w:spacing w:after="80" w:before="0" w:line="264"/>
+            </w:pPr>
+            <w:r>
+              <w:rPr>
+                <w:b/>
+                <w:bCs/>
+                <w:color w:val="2F6F88"/>
+                <w:sz w:val="19"/>
+                <w:szCs w:val="19"/>
+              </w:rPr>
+              <w:t xml:space="preserve">só nos modos que precisam dela</w:t>
+            </w:r>
+          </w:p>
+        </w:tc>
+        <w:tc>
+          <w:tcPr>
+            <w:tcW w:type="dxa" w:w="4626"/>
+            <w:tcBorders>
+              <w:top w:val="single" w:color="CBD8D2" w:sz="4"/>
+              <w:left w:val="single" w:color="CBD8D2" w:sz="4"/>
+              <w:bottom w:val="single" w:color="CBD8D2" w:sz="4"/>
+              <w:right w:val="single" w:color="CBD8D2" w:sz="4"/>
+            </w:tcBorders>
+            <w:tcMar>
+              <w:top w:type="dxa" w:w="90"/>
+              <w:left w:type="dxa" w:w="130"/>
+              <w:bottom w:type="dxa" w:w="90"/>
+              <w:right w:type="dxa" w:w="130"/>
+            </w:tcMar>
+            <w:vAlign w:val="center"/>
+          </w:tcPr>
+          <w:p>
+            <w:pPr>
+              <w:spacing w:after="80" w:before="0" w:line="264"/>
+            </w:pPr>
+            <w:r>
+              <w:rPr>
+                <w:color w:val="26332D"/>
+                <w:sz w:val="19"/>
+                <w:szCs w:val="19"/>
+              </w:rPr>
+              <w:t xml:space="preserve">O plano bloqueava o envio de TODA pergunta. Agora só os modos Alimentar LLM e Resposta via pill esperam por ele; nos demais a pergunta sai na hora, e a barra de botões colhe o mesmo plano depois, pelo cache. A chamada ao classificador acontece igual — o que deixou de existir é a espera.</w:t>
+            </w:r>
+          </w:p>
+        </w:tc>
+      </w:tr>
+      <w:tr>
+        <w:tc>
+          <w:tcPr>
+            <w:tcW w:type="dxa" w:w="2400"/>
+            <w:tcBorders>
+              <w:top w:val="single" w:color="CBD8D2" w:sz="4"/>
+              <w:left w:val="single" w:color="CBD8D2" w:sz="4"/>
+              <w:bottom w:val="single" w:color="CBD8D2" w:sz="4"/>
+              <w:right w:val="single" w:color="CBD8D2" w:sz="4"/>
+            </w:tcBorders>
+            <w:shd w:fill="F1F8FB" w:color="auto" w:val="clear"/>
+            <w:tcMar>
+              <w:top w:type="dxa" w:w="90"/>
+              <w:left w:type="dxa" w:w="130"/>
+              <w:bottom w:type="dxa" w:w="90"/>
+              <w:right w:type="dxa" w:w="130"/>
+            </w:tcMar>
+            <w:vAlign w:val="center"/>
+          </w:tcPr>
+          <w:p>
+            <w:pPr>
+              <w:spacing w:after="80" w:before="0" w:line="264"/>
+            </w:pPr>
+            <w:r>
+              <w:rPr>
+                <w:b/>
+                <w:bCs/>
+                <w:color w:val="26332D"/>
+                <w:sz w:val="19"/>
+                <w:szCs w:val="19"/>
+              </w:rPr>
+              <w:t xml:space="preserve">Teto de espera</w:t>
+            </w:r>
+          </w:p>
+        </w:tc>
+        <w:tc>
+          <w:tcPr>
+            <w:tcW w:type="dxa" w:w="2000"/>
+            <w:tcBorders>
+              <w:top w:val="single" w:color="CBD8D2" w:sz="4"/>
+              <w:left w:val="single" w:color="CBD8D2" w:sz="4"/>
+              <w:bottom w:val="single" w:color="CBD8D2" w:sz="4"/>
+              <w:right w:val="single" w:color="CBD8D2" w:sz="4"/>
+            </w:tcBorders>
+            <w:shd w:fill="F1F8FB" w:color="auto" w:val="clear"/>
+            <w:tcMar>
+              <w:top w:type="dxa" w:w="90"/>
+              <w:left w:type="dxa" w:w="130"/>
+              <w:bottom w:type="dxa" w:w="90"/>
+              <w:right w:type="dxa" w:w="130"/>
+            </w:tcMar>
+            <w:vAlign w:val="center"/>
+          </w:tcPr>
+          <w:p>
+            <w:pPr>
+              <w:spacing w:after="80" w:before="0" w:line="264"/>
+            </w:pPr>
+            <w:r>
+              <w:rPr>
+                <w:b/>
+                <w:bCs/>
+                <w:color w:val="2F6F88"/>
+                <w:sz w:val="19"/>
+                <w:szCs w:val="19"/>
+              </w:rPr>
+              <w:t xml:space="preserve">6 s no planejador, 8 s na consulta</w:t>
+            </w:r>
+          </w:p>
+        </w:tc>
+        <w:tc>
+          <w:tcPr>
+            <w:tcW w:type="dxa" w:w="4626"/>
+            <w:tcBorders>
+              <w:top w:val="single" w:color="CBD8D2" w:sz="4"/>
+              <w:left w:val="single" w:color="CBD8D2" w:sz="4"/>
+              <w:bottom w:val="single" w:color="CBD8D2" w:sz="4"/>
+              <w:right w:val="single" w:color="CBD8D2" w:sz="4"/>
+            </w:tcBorders>
+            <w:shd w:fill="F1F8FB" w:color="auto" w:val="clear"/>
+            <w:tcMar>
+              <w:top w:type="dxa" w:w="90"/>
+              <w:left w:type="dxa" w:w="130"/>
+              <w:bottom w:type="dxa" w:w="90"/>
+              <w:right w:type="dxa" w:w="130"/>
+            </w:tcMar>
+            <w:vAlign w:val="center"/>
+          </w:tcPr>
+          <w:p>
+            <w:pPr>
+              <w:spacing w:after="80" w:before="0" w:line="264"/>
+            </w:pPr>
+            <w:r>
+              <w:rPr>
+                <w:color w:val="26332D"/>
+                <w:sz w:val="19"/>
+                <w:szCs w:val="19"/>
+              </w:rPr>
+              <w:t xml:space="preserve">fetch não tem timeout: um servidor que aceita a conexão e não responde segurava a pergunta para sempre, porque a triagem roda ANTES do envio. Estourar o teto devolve bypass, que é o comportamento de sempre. Plano vazio POR FALHA não fica em cache: o próximo interessado tenta de novo.</w:t>
+            </w:r>
+          </w:p>
+        </w:tc>
+      </w:tr>
+      <w:tr>
+        <w:tc>
+          <w:tcPr>
+            <w:tcW w:type="dxa" w:w="2400"/>
+            <w:tcBorders>
+              <w:top w:val="single" w:color="CBD8D2" w:sz="4"/>
+              <w:left w:val="single" w:color="CBD8D2" w:sz="4"/>
+              <w:bottom w:val="single" w:color="CBD8D2" w:sz="4"/>
+              <w:right w:val="single" w:color="CBD8D2" w:sz="4"/>
+            </w:tcBorders>
+            <w:tcMar>
+              <w:top w:type="dxa" w:w="90"/>
+              <w:left w:type="dxa" w:w="130"/>
+              <w:bottom w:type="dxa" w:w="90"/>
+              <w:right w:type="dxa" w:w="130"/>
+            </w:tcMar>
+            <w:vAlign w:val="center"/>
+          </w:tcPr>
+          <w:p>
+            <w:pPr>
+              <w:spacing w:after="80" w:before="0" w:line="264"/>
+            </w:pPr>
+            <w:r>
+              <w:rPr>
+                <w:b/>
+                <w:bCs/>
+                <w:color w:val="26332D"/>
+                <w:sz w:val="19"/>
+                <w:szCs w:val="19"/>
+              </w:rPr>
+              <w:t xml:space="preserve">Quem autoriza a resposta direta</w:t>
+            </w:r>
+          </w:p>
+        </w:tc>
+        <w:tc>
+          <w:tcPr>
+            <w:tcW w:type="dxa" w:w="2000"/>
+            <w:tcBorders>
+              <w:top w:val="single" w:color="CBD8D2" w:sz="4"/>
+              <w:left w:val="single" w:color="CBD8D2" w:sz="4"/>
+              <w:bottom w:val="single" w:color="CBD8D2" w:sz="4"/>
+              <w:right w:val="single" w:color="CBD8D2" w:sz="4"/>
+            </w:tcBorders>
+            <w:tcMar>
+              <w:top w:type="dxa" w:w="90"/>
+              <w:left w:type="dxa" w:w="130"/>
+              <w:bottom w:type="dxa" w:w="90"/>
+              <w:right w:type="dxa" w:w="130"/>
+            </w:tcMar>
+            <w:vAlign w:val="center"/>
+          </w:tcPr>
+          <w:p>
+            <w:pPr>
+              <w:spacing w:after="80" w:before="0" w:line="264"/>
+            </w:pPr>
+            <w:r>
+              <w:rPr>
+                <w:b/>
+                <w:bCs/>
+                <w:color w:val="2F6F88"/>
+                <w:sz w:val="19"/>
+                <w:szCs w:val="19"/>
+              </w:rPr>
+              <w:t xml:space="preserve">o cliente, por padrão de saudação</w:t>
+            </w:r>
+          </w:p>
+        </w:tc>
+        <w:tc>
+          <w:tcPr>
+            <w:tcW w:type="dxa" w:w="4626"/>
+            <w:tcBorders>
+              <w:top w:val="single" w:color="CBD8D2" w:sz="4"/>
+              <w:left w:val="single" w:color="CBD8D2" w:sz="4"/>
+              <w:bottom w:val="single" w:color="CBD8D2" w:sz="4"/>
+              <w:right w:val="single" w:color="CBD8D2" w:sz="4"/>
+            </w:tcBorders>
+            <w:tcMar>
+              <w:top w:type="dxa" w:w="90"/>
+              <w:left w:type="dxa" w:w="130"/>
+              <w:bottom w:type="dxa" w:w="90"/>
+              <w:right w:type="dxa" w:w="130"/>
+            </w:tcMar>
+            <w:vAlign w:val="center"/>
+          </w:tcPr>
+          <w:p>
+            <w:pPr>
+              <w:spacing w:after="80" w:before="0" w:line="264"/>
+            </w:pPr>
+            <w:r>
+              <w:rPr>
+                <w:color w:val="26332D"/>
+                <w:sz w:val="19"/>
+                <w:szCs w:val="19"/>
+              </w:rPr>
+              <w:t xml:space="preserve">Sem ação, direct só vale para saudação, agradecimento, despedida ou pergunta sobre o próprio assistente — reconhecidos por padrão determinístico no cliente, não pela palavra do classificador. A trava anterior era «não há resposta anterior na thread», que protegia a conversa em andamento e deixava a PRIMEIRA mensagem descoberta.</w:t>
+            </w:r>
+          </w:p>
+        </w:tc>
+      </w:tr>
+      <w:tr>
+        <w:tc>
+          <w:tcPr>
+            <w:tcW w:type="dxa" w:w="2400"/>
+            <w:tcBorders>
+              <w:top w:val="single" w:color="CBD8D2" w:sz="4"/>
+              <w:left w:val="single" w:color="CBD8D2" w:sz="4"/>
+              <w:bottom w:val="single" w:color="CBD8D2" w:sz="4"/>
+              <w:right w:val="single" w:color="CBD8D2" w:sz="4"/>
+            </w:tcBorders>
+            <w:shd w:fill="F1F8FB" w:color="auto" w:val="clear"/>
+            <w:tcMar>
+              <w:top w:type="dxa" w:w="90"/>
+              <w:left w:type="dxa" w:w="130"/>
+              <w:bottom w:type="dxa" w:w="90"/>
+              <w:right w:type="dxa" w:w="130"/>
+            </w:tcMar>
+            <w:vAlign w:val="center"/>
+          </w:tcPr>
+          <w:p>
+            <w:pPr>
+              <w:spacing w:after="80" w:before="0" w:line="264"/>
+            </w:pPr>
+            <w:r>
+              <w:rPr>
+                <w:b/>
+                <w:bCs/>
+                <w:color w:val="26332D"/>
+                <w:sz w:val="19"/>
+                <w:szCs w:val="19"/>
+              </w:rPr>
+              <w:t xml:space="preserve">Instruções do planejador</w:t>
+            </w:r>
+          </w:p>
+        </w:tc>
+        <w:tc>
+          <w:tcPr>
+            <w:tcW w:type="dxa" w:w="2000"/>
+            <w:tcBorders>
+              <w:top w:val="single" w:color="CBD8D2" w:sz="4"/>
+              <w:left w:val="single" w:color="CBD8D2" w:sz="4"/>
+              <w:bottom w:val="single" w:color="CBD8D2" w:sz="4"/>
+              <w:right w:val="single" w:color="CBD8D2" w:sz="4"/>
+            </w:tcBorders>
+            <w:shd w:fill="F1F8FB" w:color="auto" w:val="clear"/>
+            <w:tcMar>
+              <w:top w:type="dxa" w:w="90"/>
+              <w:left w:type="dxa" w:w="130"/>
+              <w:bottom w:type="dxa" w:w="90"/>
+              <w:right w:type="dxa" w:w="130"/>
+            </w:tcMar>
+            <w:vAlign w:val="center"/>
+          </w:tcPr>
+          <w:p>
+            <w:pPr>
+              <w:spacing w:after="80" w:before="0" w:line="264"/>
+            </w:pPr>
+            <w:r>
+              <w:rPr>
+                <w:b/>
+                <w:bCs/>
+                <w:color w:val="2F6F88"/>
+                <w:sz w:val="19"/>
+                <w:szCs w:val="19"/>
+              </w:rPr>
+              <w:t xml:space="preserve">no systemPrompt</w:t>
+            </w:r>
+          </w:p>
+        </w:tc>
+        <w:tc>
+          <w:tcPr>
+            <w:tcW w:type="dxa" w:w="4626"/>
+            <w:tcBorders>
+              <w:top w:val="single" w:color="CBD8D2" w:sz="4"/>
+              <w:left w:val="single" w:color="CBD8D2" w:sz="4"/>
+              <w:bottom w:val="single" w:color="CBD8D2" w:sz="4"/>
+              <w:right w:val="single" w:color="CBD8D2" w:sz="4"/>
+            </w:tcBorders>
+            <w:shd w:fill="F1F8FB" w:color="auto" w:val="clear"/>
+            <w:tcMar>
+              <w:top w:type="dxa" w:w="90"/>
+              <w:left w:type="dxa" w:w="130"/>
+              <w:bottom w:type="dxa" w:w="90"/>
+              <w:right w:type="dxa" w:w="130"/>
+            </w:tcMar>
+            <w:vAlign w:val="center"/>
+          </w:tcPr>
+          <w:p>
+            <w:pPr>
+              <w:spacing w:after="80" w:before="0" w:line="264"/>
+            </w:pPr>
+            <w:r>
+              <w:rPr>
+                <w:color w:val="26332D"/>
+                <w:sz w:val="19"/>
+                <w:szCs w:val="19"/>
+              </w:rPr>
+              <w:t xml:space="preserve">Iam coladas à pergunta, na mensagem do usuário. No systemPrompt viram prefixo estável, que o cache de prompt aproveita, com promptCacheKey por idioma. A suíte manda a mesma forma, senão mediria uma requisição que o app não faz.</w:t>
+            </w:r>
+          </w:p>
+        </w:tc>
+      </w:tr>
+      <w:tr>
+        <w:tc>
+          <w:tcPr>
+            <w:tcW w:type="dxa" w:w="2400"/>
+            <w:tcBorders>
+              <w:top w:val="single" w:color="CBD8D2" w:sz="4"/>
+              <w:left w:val="single" w:color="CBD8D2" w:sz="4"/>
+              <w:bottom w:val="single" w:color="CBD8D2" w:sz="4"/>
+              <w:right w:val="single" w:color="CBD8D2" w:sz="4"/>
+            </w:tcBorders>
+            <w:tcMar>
+              <w:top w:type="dxa" w:w="90"/>
+              <w:left w:type="dxa" w:w="130"/>
+              <w:bottom w:type="dxa" w:w="90"/>
+              <w:right w:type="dxa" w:w="130"/>
+            </w:tcMar>
+            <w:vAlign w:val="center"/>
+          </w:tcPr>
+          <w:p>
+            <w:pPr>
+              <w:spacing w:after="80" w:before="0" w:line="264"/>
+            </w:pPr>
+            <w:r>
+              <w:rPr>
+                <w:b/>
+                <w:bCs/>
+                <w:color w:val="26332D"/>
+                <w:sz w:val="19"/>
+                <w:szCs w:val="19"/>
+              </w:rPr>
+              <w:t xml:space="preserve">Contagem no card</w:t>
+            </w:r>
+          </w:p>
+        </w:tc>
+        <w:tc>
+          <w:tcPr>
+            <w:tcW w:type="dxa" w:w="2000"/>
+            <w:tcBorders>
+              <w:top w:val="single" w:color="CBD8D2" w:sz="4"/>
+              <w:left w:val="single" w:color="CBD8D2" w:sz="4"/>
+              <w:bottom w:val="single" w:color="CBD8D2" w:sz="4"/>
+              <w:right w:val="single" w:color="CBD8D2" w:sz="4"/>
+            </w:tcBorders>
+            <w:tcMar>
+              <w:top w:type="dxa" w:w="90"/>
+              <w:left w:type="dxa" w:w="130"/>
+              <w:bottom w:type="dxa" w:w="90"/>
+              <w:right w:type="dxa" w:w="130"/>
+            </w:tcMar>
+            <w:vAlign w:val="center"/>
+          </w:tcPr>
+          <w:p>
+            <w:pPr>
+              <w:spacing w:after="80" w:before="0" w:line="264"/>
+            </w:pPr>
+            <w:r>
+              <w:rPr>
+                <w:b/>
+                <w:bCs/>
+                <w:color w:val="2F6F88"/>
+                <w:sz w:val="19"/>
+                <w:szCs w:val="19"/>
+              </w:rPr>
+              <w:t xml:space="preserve">12+ quando o lote satura</w:t>
+            </w:r>
+          </w:p>
+        </w:tc>
+        <w:tc>
+          <w:tcPr>
+            <w:tcW w:type="dxa" w:w="4626"/>
+            <w:tcBorders>
+              <w:top w:val="single" w:color="CBD8D2" w:sz="4"/>
+              <w:left w:val="single" w:color="CBD8D2" w:sz="4"/>
+              <w:bottom w:val="single" w:color="CBD8D2" w:sz="4"/>
+              <w:right w:val="single" w:color="CBD8D2" w:sz="4"/>
+            </w:tcBorders>
+            <w:tcMar>
+              <w:top w:type="dxa" w:w="90"/>
+              <w:left w:type="dxa" w:w="130"/>
+              <w:bottom w:type="dxa" w:w="90"/>
+              <w:right w:type="dxa" w:w="130"/>
+            </w:tcMar>
+            <w:vAlign w:val="center"/>
+          </w:tcPr>
+          <w:p>
+            <w:pPr>
+              <w:spacing w:after="80" w:before="0" w:line="264"/>
+            </w:pPr>
+            <w:r>
+              <w:rPr>
+                <w:color w:val="26332D"/>
+                <w:sz w:val="19"/>
+                <w:szCs w:val="19"/>
+              </w:rPr>
+              <w:t xml:space="preserve">O mesmo rótulo dizia coisas diferentes: em search_book era o tamanho do lote; em search_verbete, o totalFound real. O card passa a marcar quando o número é apenas um piso.</w:t>
+            </w:r>
+          </w:p>
+        </w:tc>
+      </w:tr>
+      <w:tr>
+        <w:tc>
+          <w:tcPr>
+            <w:tcW w:type="dxa" w:w="2400"/>
+            <w:tcBorders>
+              <w:top w:val="single" w:color="CBD8D2" w:sz="4"/>
+              <w:left w:val="single" w:color="CBD8D2" w:sz="4"/>
+              <w:bottom w:val="single" w:color="CBD8D2" w:sz="4"/>
+              <w:right w:val="single" w:color="CBD8D2" w:sz="4"/>
+            </w:tcBorders>
+            <w:shd w:fill="F1F8FB" w:color="auto" w:val="clear"/>
+            <w:tcMar>
+              <w:top w:type="dxa" w:w="90"/>
+              <w:left w:type="dxa" w:w="130"/>
+              <w:bottom w:type="dxa" w:w="90"/>
+              <w:right w:type="dxa" w:w="130"/>
+            </w:tcMar>
+            <w:vAlign w:val="center"/>
+          </w:tcPr>
+          <w:p>
+            <w:pPr>
+              <w:spacing w:after="80" w:before="0" w:line="264"/>
+            </w:pPr>
+            <w:r>
+              <w:rPr>
+                <w:b/>
+                <w:bCs/>
+                <w:color w:val="26332D"/>
+                <w:sz w:val="19"/>
+                <w:szCs w:val="19"/>
+              </w:rPr>
+              <w:t xml:space="preserve">Dicionários: modo da consulta</w:t>
+            </w:r>
+          </w:p>
+        </w:tc>
+        <w:tc>
+          <w:tcPr>
+            <w:tcW w:type="dxa" w:w="2000"/>
+            <w:tcBorders>
+              <w:top w:val="single" w:color="CBD8D2" w:sz="4"/>
+              <w:left w:val="single" w:color="CBD8D2" w:sz="4"/>
+              <w:bottom w:val="single" w:color="CBD8D2" w:sz="4"/>
+              <w:right w:val="single" w:color="CBD8D2" w:sz="4"/>
+            </w:tcBorders>
+            <w:shd w:fill="F1F8FB" w:color="auto" w:val="clear"/>
+            <w:tcMar>
+              <w:top w:type="dxa" w:w="90"/>
+              <w:left w:type="dxa" w:w="130"/>
+              <w:bottom w:type="dxa" w:w="90"/>
+              <w:right w:type="dxa" w:w="130"/>
+            </w:tcMar>
+            <w:vAlign w:val="center"/>
+          </w:tcPr>
+          <w:p>
+            <w:pPr>
+              <w:spacing w:after="80" w:before="0" w:line="264"/>
+            </w:pPr>
+            <w:r>
+              <w:rPr>
+                <w:b/>
+                <w:bCs/>
+                <w:color w:val="2F6F88"/>
+                <w:sz w:val="19"/>
+                <w:szCs w:val="19"/>
+              </w:rPr>
+              <w:t xml:space="preserve">completo</w:t>
+            </w:r>
+          </w:p>
+        </w:tc>
+        <w:tc>
+          <w:tcPr>
+            <w:tcW w:type="dxa" w:w="4626"/>
+            <w:tcBorders>
+              <w:top w:val="single" w:color="CBD8D2" w:sz="4"/>
+              <w:left w:val="single" w:color="CBD8D2" w:sz="4"/>
+              <w:bottom w:val="single" w:color="CBD8D2" w:sz="4"/>
+              <w:right w:val="single" w:color="CBD8D2" w:sz="4"/>
+            </w:tcBorders>
+            <w:shd w:fill="F1F8FB" w:color="auto" w:val="clear"/>
+            <w:tcMar>
+              <w:top w:type="dxa" w:w="90"/>
+              <w:left w:type="dxa" w:w="130"/>
+              <w:bottom w:type="dxa" w:w="90"/>
+              <w:right w:type="dxa" w:w="130"/>
+            </w:tcMar>
+            <w:vAlign w:val="center"/>
+          </w:tcPr>
+          <w:p>
+            <w:pPr>
+              <w:spacing w:after="80" w:before="0" w:line="264"/>
+            </w:pPr>
+            <w:r>
+              <w:rPr>
+                <w:color w:val="26332D"/>
+                <w:sz w:val="19"/>
+                <w:szCs w:val="19"/>
+              </w:rPr>
+              <w:t xml:space="preserve">O endpoint usa analogico por padrão, e a metade sinonímica que esta ficha promete ao classificador nunca voltava.</w:t>
+            </w:r>
+          </w:p>
+        </w:tc>
+      </w:tr>
+      <w:tr>
+        <w:tc>
+          <w:tcPr>
+            <w:tcW w:type="dxa" w:w="2400"/>
+            <w:tcBorders>
+              <w:top w:val="single" w:color="CBD8D2" w:sz="4"/>
+              <w:left w:val="single" w:color="CBD8D2" w:sz="4"/>
+              <w:bottom w:val="single" w:color="CBD8D2" w:sz="4"/>
+              <w:right w:val="single" w:color="CBD8D2" w:sz="4"/>
+            </w:tcBorders>
+            <w:tcMar>
+              <w:top w:type="dxa" w:w="90"/>
+              <w:left w:type="dxa" w:w="130"/>
+              <w:bottom w:type="dxa" w:w="90"/>
+              <w:right w:type="dxa" w:w="130"/>
+            </w:tcMar>
+            <w:vAlign w:val="center"/>
+          </w:tcPr>
+          <w:p>
+            <w:pPr>
+              <w:spacing w:after="80" w:before="0" w:line="264"/>
+            </w:pPr>
+            <w:r>
+              <w:rPr>
+                <w:b/>
+                <w:bCs/>
+                <w:color w:val="26332D"/>
+                <w:sz w:val="19"/>
+                <w:szCs w:val="19"/>
+              </w:rPr>
+              <w:t xml:space="preserve">Padrão em build</w:t>
+            </w:r>
+          </w:p>
+        </w:tc>
+        <w:tc>
+          <w:tcPr>
+            <w:tcW w:type="dxa" w:w="2000"/>
+            <w:tcBorders>
+              <w:top w:val="single" w:color="CBD8D2" w:sz="4"/>
+              <w:left w:val="single" w:color="CBD8D2" w:sz="4"/>
+              <w:bottom w:val="single" w:color="CBD8D2" w:sz="4"/>
+              <w:right w:val="single" w:color="CBD8D2" w:sz="4"/>
+            </w:tcBorders>
+            <w:tcMar>
+              <w:top w:type="dxa" w:w="90"/>
+              <w:left w:type="dxa" w:w="130"/>
+              <w:bottom w:type="dxa" w:w="90"/>
+              <w:right w:type="dxa" w:w="130"/>
+            </w:tcMar>
+            <w:vAlign w:val="center"/>
+          </w:tcPr>
+          <w:p>
+            <w:pPr>
+              <w:spacing w:after="80" w:before="0" w:line="264"/>
+            </w:pPr>
+            <w:r>
+              <w:rPr>
+                <w:b/>
+                <w:bCs/>
+                <w:color w:val="2F6F88"/>
+                <w:sz w:val="19"/>
+                <w:szCs w:val="19"/>
+              </w:rPr>
+              <w:t xml:space="preserve">ligado (AGENT_MODE_DEFAULT = 1)</w:t>
+            </w:r>
+          </w:p>
+        </w:tc>
+        <w:tc>
+          <w:tcPr>
+            <w:tcW w:type="dxa" w:w="4626"/>
+            <w:tcBorders>
+              <w:top w:val="single" w:color="CBD8D2" w:sz="4"/>
+              <w:left w:val="single" w:color="CBD8D2" w:sz="4"/>
+              <w:bottom w:val="single" w:color="CBD8D2" w:sz="4"/>
+              <w:right w:val="single" w:color="CBD8D2" w:sz="4"/>
+            </w:tcBorders>
+            <w:tcMar>
+              <w:top w:type="dxa" w:w="90"/>
+              <w:left w:type="dxa" w:w="130"/>
+              <w:bottom w:type="dxa" w:w="90"/>
+              <w:right w:type="dxa" w:w="130"/>
+            </w:tcMar>
+            <w:vAlign w:val="center"/>
+          </w:tcPr>
+          <w:p>
+            <w:pPr>
+              <w:spacing w:after="80" w:before="0" w:line="264"/>
+            </w:pPr>
+            <w:r>
+              <w:rPr>
+                <w:color w:val="26332D"/>
+                <w:sz w:val="19"/>
+                <w:szCs w:val="19"/>
+              </w:rPr>
+              <w:t xml:space="preserve">O comentário do código afirmava que produção ia ligada e o valor era 0. Vale ligado, e o cabeçalho passou a dizer o mesmo.</w:t>
             </w:r>
           </w:p>
         </w:tc>
@@ -1542,7 +2244,7 @@
                 <w:sz w:val="19"/>
                 <w:szCs w:val="19"/>
               </w:rPr>
-              <w:t xml:space="preserve">Modo Agente ligado · Classificador LLM · Busca Integrada</w:t>
+              <w:t xml:space="preserve">Modo Agente ligado · Classificador LLM · Abrir módulo · Resposta da LLM automática</w:t>
             </w:r>
           </w:p>
         </w:tc>
@@ -1641,7 +2343,7 @@
                 <w:sz w:val="19"/>
                 <w:szCs w:val="19"/>
               </w:rPr>
-              <w:t xml:space="preserve">Busca Integrada (padrão) · Abrir módulo · Alimentar LLM</w:t>
+              <w:t xml:space="preserve">Abrir módulo (padrão) · Busca Integrada · Alimentar LLM</w:t>
             </w:r>
           </w:p>
         </w:tc>
@@ -2437,7 +3139,7 @@
                 <w:sz w:val="19"/>
                 <w:szCs w:val="19"/>
               </w:rPr>
-              <w:t xml:space="preserve">1 por pergunta, qualquer que seja o nº de intenções</w:t>
+              <w:t xml:space="preserve">1 por pergunta, qualquer que seja o nº de intenções. Só é esperada antes do envio nos modos Alimentar LLM e Resposta via pill; nos demais a pergunta sai na hora e a barra de botões colhe o mesmo plano depois</w:t>
             </w:r>
           </w:p>
         </w:tc>
@@ -2636,7 +3338,7 @@
                 <w:sz w:val="19"/>
                 <w:szCs w:val="19"/>
               </w:rPr>
-              <w:t xml:space="preserve">Nenhuma ação, em silêncio</w:t>
+              <w:t xml:space="preserve">Nenhuma ação, em silêncio. Teto de espera: 6 s no planejador, 8 s na consulta — sem eles, um servidor que aceita a conexão e não responde segurava o envio da pergunta</w:t>
             </w:r>
           </w:p>
         </w:tc>
@@ -2835,7 +3537,7 @@
                 <w:sz w:val="19"/>
                 <w:szCs w:val="19"/>
               </w:rPr>
-              <w:t xml:space="preserve">51 exemplos destas fichas</w:t>
+              <w:t xml:space="preserve">67 exemplos destas fichas</w:t>
             </w:r>
           </w:p>
         </w:tc>
@@ -2867,7 +3569,7 @@
                 <w:sz w:val="17"/>
                 <w:szCs w:val="17"/>
               </w:rPr>
-              <w:t xml:space="preserve">43 casos determinísticos passam; 8 dependem do LLM</w:t>
+              <w:t xml:space="preserve">65 estáveis, 1 instável, 1 falha na última execução ao vivo (3 execuções por caso); 0 ações indevidas em 84 execuções</w:t>
             </w:r>
           </w:p>
         </w:tc>
@@ -2975,7 +3677,7 @@
           <w:sz w:val="19"/>
           <w:szCs w:val="19"/>
         </w:rPr>
-        <w:t xml:space="preserve">Classificador LLM sem teste ao vivo — </w:t>
+        <w:t xml:space="preserve">Pedido bibliográfico sem verbo — </w:t>
       </w:r>
       <w:r>
         <w:rPr>
@@ -2983,7 +3685,7 @@
           <w:sz w:val="19"/>
           <w:szCs w:val="19"/>
         </w:rPr>
-        <w:t xml:space="preserve">As 4 intenções foram validadas no modo Regras com a suíte de exemplos. O modo Classificador depende do Main-Server local, que esteve fora no fechamento desta versão.</w:t>
+        <w:t xml:space="preserve">A suíte do planejador (npm run agent:suite) passou a rodar ao vivo contra o Main-Server, com 3 execuções por caso: 65 estáveis, 1 instável, 1 falha, e nenhuma ação indevida em 84 execuções — o modo Classificador deixou de ser a parte não verificada do catálogo. O que resta é «Livro Temas da Conscienciologia.», frase sem verbo que o classificador não lê como pedido bibliográfico; as instáveis ficam na fronteira livros × verbetes, onde as duas respostas se defendem. A suíte aplica a MESMA trava que o cliente aplica antes de aceitar um direct, então o que ela mede é a decisão efetiva do app, não o palpite cru do classificador.</w:t>
       </w:r>
     </w:p>
     <w:p>

</xml_diff>